<commit_message>
Restore working version (revert bad upload) + add VA broker compensation question
Reverts the accidental upload (1231281) that overwrote the app with an old
copy, restoring all files to ade5971. Adds the Virginia broker-compensation
question to both forms so VA deals capture VA_Broker_Pays / VA_Broker_Amount.

Co-Authored-By: Claude Opus 4.8 <noreply@anthropic.com>
Claude-Session: https://claude.ai/code/session_013JkBGFdAqCCF9KJrJbKyom
</commit_message>
<xml_diff>
--- a/FUNDGATE_TEMPLATE_DAILY.docx
+++ b/FUNDGATE_TEMPLATE_DAILY.docx
@@ -6180,7 +6180,7 @@
         <w:rPr>
           <w:color w:val="010202"/>
         </w:rPr>
-        <w:t>"Business Day" means any day on which commercial banks in New York, New York, or in the principal place of business of Financial Institution, are not authorized to be open or are required to be closed for commercial transactions under applicable law, rule or regulation.</w:t>
+        <w:t>"Business Day" means any day other than a Saturday, Sunday, or other day on which commercial banks in New York, New York, or in the principal place of business of Financial Institution, are authorized or required to be closed for commercial transactions under applicable law, rule or regulation.</w:t>
       </w:r>
     </w:p>
     <w:p>
@@ -7318,7 +7318,7 @@
         <w:rPr>
           <w:color w:val="010202"/>
         </w:rPr>
-        <w:t>"Party" and "Parties" have the respective meanings set forth in the heading to this Agreement, except that in Section 10, the terms</w:t>
+        <w:t>"Party" and "Parties" have the respective meanings set forth in the heading to this Agreement, except that in Section 12, the terms</w:t>
       </w:r>
       <w:r>
         <w:rPr>
@@ -8571,7 +8571,7 @@
         <w:rPr>
           <w:color w:val="010202"/>
         </w:rPr>
-        <w:t>11.13. "Specific Daily Amount" has the meaning set forth in Section 1.2.</w:t>
+        <w:t>9.14. "Specific Daily Amount" has the meaning set forth in Section 1.2.</w:t>
       </w:r>
     </w:p>
     <w:p>
@@ -9984,6 +9984,7 @@
         <w:pStyle w:val="BodyText"/>
         <w:jc w:val="both"/>
         <w:sectPr>
+          <w:type w:val="continuous"/>
           <w:pgSz w:w="12240" w:h="15840"/>
           <w:pgMar w:top="580" w:right="360" w:bottom="500" w:left="360" w:header="0" w:footer="311" w:gutter="0"/>
           <w:cols w:space="720"/>
@@ -10511,6 +10512,7 @@
         <w:pStyle w:val="ListParagraph"/>
         <w:spacing w:line="247" w:lineRule="auto"/>
         <w:sectPr>
+          <w:type w:val="continuous"/>
           <w:pgSz w:w="12240" w:h="15840"/>
           <w:pgMar w:top="580" w:right="360" w:bottom="500" w:left="360" w:header="0" w:footer="311" w:gutter="0"/>
           <w:cols w:space="720"/>
@@ -11469,6 +11471,7 @@
         <w:pStyle w:val="ListParagraph"/>
         <w:spacing w:line="247" w:lineRule="auto"/>
         <w:sectPr>
+          <w:type w:val="continuous"/>
           <w:pgSz w:w="12240" w:h="15840"/>
           <w:pgMar w:top="580" w:right="360" w:bottom="500" w:left="360" w:header="0" w:footer="311" w:gutter="0"/>
           <w:cols w:space="720"/>
@@ -11505,7 +11508,7 @@
         <w:rPr>
           <w:color w:val="010202"/>
         </w:rPr>
-        <w:t>Notice of Certain Events. To the extent reasonably practicable, Merchant shall give Purchaser written notice of its intention to file a Bankruptcy Case at least five (5) Business Days prior to the filing of any Bankruptcy Case. Merchant shall give Purchaser written notice at least ten (10) days prior to the closing of any transaction described in Section 6.13</w:t>
+        <w:t>Notice of Certain Events. To the extent reasonably practicable, Merchant shall give Purchaser written notice of its intention to file a Bankruptcy Case at least five (5) Business Days prior to the filing of any Bankruptcy Case. Merchant shall give Purchaser written notice at least ten (10) days prior to the closing of any transaction described in Section 6.11</w:t>
       </w:r>
     </w:p>
     <w:p>
@@ -11725,19 +11728,311 @@
         <w:rPr>
           <w:color w:val="010202"/>
         </w:rPr>
-        <w:t>If Merchant breaches any representation, warranty, covenant, agreement or other provision of this Agreement, Purchaser may, without any demand, protest, notice of protest or other notice of any kind, all of which Merchant hereby</w:t>
-      </w:r>
-      <w:r>
-        <w:rPr>
-          <w:color w:val="010202"/>
-        </w:rPr>
-        <w:t xml:space="preserve"> </w:t>
-      </w:r>
-      <w:r>
-        <w:rPr>
-          <w:color w:val="010202"/>
-        </w:rPr>
-        <w:t>waives, proceed to protect and enforce its rights or remedies set forth below in this Section 7.1 and such other rights and remedies available to it under applicable law, whether by suit for specific performance or other equitable relief or by action at law, or both, or otherwise, including an action for breach of this Agreement and monetary damages as a result thereof:</w:t>
+        <w:t>7.1</w:t>
+        <w:tab/>
+      </w:r>
+      <w:r>
+        <w:rPr>
+          <w:color w:val="010202"/>
+        </w:rPr>
+        <w:t>Events of Default.  The occurrence of any one or more of the following shall constitute an "Event of Default" under this Agreement:</w:t>
+      </w:r>
+    </w:p>
+    <w:p>
+      <w:pPr>
+        <w:pStyle w:val="ListParagraph"/>
+        <w:numPr>
+          <w:ilvl w:val="1"/>
+          <w:numId w:val="7"/>
+        </w:numPr>
+        <w:spacing w:line="247" w:lineRule="auto"/>
+        <w:ind w:right="117" w:left="360" w:hanging="360"/>
+        <w:tabs>
+          <w:tab w:val="left" w:pos="360"/>
+        </w:tabs>
+      </w:pPr>
+      <w:r>
+        <w:rPr>
+          <w:color w:val="010202"/>
+        </w:rPr>
+        <w:t>(a)</w:t>
+        <w:tab/>
+      </w:r>
+      <w:r>
+        <w:rPr>
+          <w:color w:val="010202"/>
+        </w:rPr>
+        <w:t>any representation or warranty made by Merchant or any Owner/Guarantor in this Agreement, any Ancillary Document, or any application or information furnished to Purchaser proves to have been false or misleading in any material respect when made;</w:t>
+      </w:r>
+    </w:p>
+    <w:p>
+      <w:pPr>
+        <w:pStyle w:val="ListParagraph"/>
+        <w:numPr>
+          <w:ilvl w:val="1"/>
+          <w:numId w:val="7"/>
+        </w:numPr>
+        <w:spacing w:line="247" w:lineRule="auto"/>
+        <w:ind w:right="117" w:left="360" w:hanging="360"/>
+        <w:tabs>
+          <w:tab w:val="left" w:pos="360"/>
+        </w:tabs>
+      </w:pPr>
+      <w:r>
+        <w:rPr>
+          <w:color w:val="010202"/>
+        </w:rPr>
+        <w:t>(b)</w:t>
+        <w:tab/>
+      </w:r>
+      <w:r>
+        <w:rPr>
+          <w:color w:val="010202"/>
+        </w:rPr>
+        <w:t>Merchant revokes, blocks, stops, rescinds, or attempts to revoke, block, stop, or rescind the authorization for ACH Debits granted under Section 2, or otherwise interferes with any ACH Debit permitted by this Agreement, other than in connection with a good-faith Reconciliation Request made in accordance with Section 3;</w:t>
+      </w:r>
+    </w:p>
+    <w:p>
+      <w:pPr>
+        <w:pStyle w:val="ListParagraph"/>
+        <w:numPr>
+          <w:ilvl w:val="1"/>
+          <w:numId w:val="7"/>
+        </w:numPr>
+        <w:spacing w:line="247" w:lineRule="auto"/>
+        <w:ind w:right="117" w:left="360" w:hanging="360"/>
+        <w:tabs>
+          <w:tab w:val="left" w:pos="360"/>
+        </w:tabs>
+      </w:pPr>
+      <w:r>
+        <w:rPr>
+          <w:color w:val="010202"/>
+        </w:rPr>
+        <w:t>(c)</w:t>
+        <w:tab/>
+      </w:r>
+      <w:r>
+        <w:rPr>
+          <w:color w:val="010202"/>
+        </w:rPr>
+        <w:t>Merchant changes or closes the Specified Account, changes the Financial Institution, or directs or permits Receipts to be deposited into any account other than the Specified Account, without the prior written consent of Purchaser required by Section 2.3;</w:t>
+      </w:r>
+    </w:p>
+    <w:p>
+      <w:pPr>
+        <w:pStyle w:val="ListParagraph"/>
+        <w:numPr>
+          <w:ilvl w:val="1"/>
+          <w:numId w:val="7"/>
+        </w:numPr>
+        <w:spacing w:line="247" w:lineRule="auto"/>
+        <w:ind w:right="117" w:left="360" w:hanging="360"/>
+        <w:tabs>
+          <w:tab w:val="left" w:pos="360"/>
+        </w:tabs>
+      </w:pPr>
+      <w:r>
+        <w:rPr>
+          <w:color w:val="010202"/>
+        </w:rPr>
+        <w:t>(d)</w:t>
+        <w:tab/>
+      </w:r>
+      <w:r>
+        <w:rPr>
+          <w:color w:val="010202"/>
+        </w:rPr>
+        <w:t>Merchant enters into any arrangement, agreement, or transaction for additional sales-based financing, merchant cash advance, or factoring of its Receipts in breach of Section 6.9 (commonly referred to as "stacking");</w:t>
+      </w:r>
+    </w:p>
+    <w:p>
+      <w:pPr>
+        <w:pStyle w:val="ListParagraph"/>
+        <w:numPr>
+          <w:ilvl w:val="1"/>
+          <w:numId w:val="7"/>
+        </w:numPr>
+        <w:spacing w:line="247" w:lineRule="auto"/>
+        <w:ind w:right="117" w:left="360" w:hanging="360"/>
+        <w:tabs>
+          <w:tab w:val="left" w:pos="360"/>
+        </w:tabs>
+      </w:pPr>
+      <w:r>
+        <w:rPr>
+          <w:color w:val="010202"/>
+        </w:rPr>
+        <w:t>(e)</w:t>
+        <w:tab/>
+      </w:r>
+      <w:r>
+        <w:rPr>
+          <w:color w:val="010202"/>
+        </w:rPr>
+        <w:t>Merchant sells, transfers, assigns, pledges, or grants a Lien upon the Purchased Receipts or any portion thereof in breach of Section 6.5, or the Purchased Receipts otherwise become subject to any Lien in favor of any Person other than Purchaser;</w:t>
+      </w:r>
+    </w:p>
+    <w:p>
+      <w:pPr>
+        <w:pStyle w:val="ListParagraph"/>
+        <w:numPr>
+          <w:ilvl w:val="1"/>
+          <w:numId w:val="7"/>
+        </w:numPr>
+        <w:spacing w:line="247" w:lineRule="auto"/>
+        <w:ind w:right="117" w:left="360" w:hanging="360"/>
+        <w:tabs>
+          <w:tab w:val="left" w:pos="360"/>
+        </w:tabs>
+      </w:pPr>
+      <w:r>
+        <w:rPr>
+          <w:color w:val="010202"/>
+        </w:rPr>
+        <w:t>(f)</w:t>
+        <w:tab/>
+      </w:r>
+      <w:r>
+        <w:rPr>
+          <w:color w:val="010202"/>
+        </w:rPr>
+        <w:t>Merchant ceases to conduct its business in the ordinary course, permanently closes or dissolves, or transfers or sells all or substantially all of its assets in breach of Section 6.6 or Section 6.11, other than a temporary closure permitted under Section 6.6;</w:t>
+      </w:r>
+    </w:p>
+    <w:p>
+      <w:pPr>
+        <w:pStyle w:val="ListParagraph"/>
+        <w:numPr>
+          <w:ilvl w:val="1"/>
+          <w:numId w:val="7"/>
+        </w:numPr>
+        <w:spacing w:line="247" w:lineRule="auto"/>
+        <w:ind w:right="117" w:left="360" w:hanging="360"/>
+        <w:tabs>
+          <w:tab w:val="left" w:pos="360"/>
+        </w:tabs>
+      </w:pPr>
+      <w:r>
+        <w:rPr>
+          <w:color w:val="010202"/>
+        </w:rPr>
+        <w:t>(g)</w:t>
+        <w:tab/>
+      </w:r>
+      <w:r>
+        <w:rPr>
+          <w:color w:val="010202"/>
+        </w:rPr>
+        <w:t>Merchant or any Owner/Guarantor (i) commences, or has commenced against it and not dismissed within sixty (60) days, any proceeding under any bankruptcy, insolvency, or similar law, (ii) makes a general assignment for the benefit of creditors, (iii) has a receiver, trustee, or custodian appointed for it or for a substantial part of its property, or (iv) admits in writing its inability to pay its debts as they become due;</w:t>
+      </w:r>
+    </w:p>
+    <w:p>
+      <w:pPr>
+        <w:pStyle w:val="ListParagraph"/>
+        <w:numPr>
+          <w:ilvl w:val="1"/>
+          <w:numId w:val="7"/>
+        </w:numPr>
+        <w:spacing w:line="247" w:lineRule="auto"/>
+        <w:ind w:right="117" w:left="360" w:hanging="360"/>
+        <w:tabs>
+          <w:tab w:val="left" w:pos="360"/>
+        </w:tabs>
+      </w:pPr>
+      <w:r>
+        <w:rPr>
+          <w:color w:val="010202"/>
+        </w:rPr>
+        <w:t>(h)</w:t>
+        <w:tab/>
+      </w:r>
+      <w:r>
+        <w:rPr>
+          <w:color w:val="010202"/>
+        </w:rPr>
+        <w:t>Merchant changes its name, entity type, or the location of its business in breach of Section 6.10, or forms, acquires, or uses any other entity or deposit account for the purpose of diverting Receipts or evading its obligations under this Agreement;</w:t>
+      </w:r>
+    </w:p>
+    <w:p>
+      <w:pPr>
+        <w:pStyle w:val="ListParagraph"/>
+        <w:numPr>
+          <w:ilvl w:val="1"/>
+          <w:numId w:val="7"/>
+        </w:numPr>
+        <w:spacing w:line="247" w:lineRule="auto"/>
+        <w:ind w:right="117" w:left="360" w:hanging="360"/>
+        <w:tabs>
+          <w:tab w:val="left" w:pos="360"/>
+        </w:tabs>
+      </w:pPr>
+      <w:r>
+        <w:rPr>
+          <w:color w:val="010202"/>
+        </w:rPr>
+        <w:t>(i)</w:t>
+        <w:tab/>
+      </w:r>
+      <w:r>
+        <w:rPr>
+          <w:color w:val="010202"/>
+        </w:rPr>
+        <w:t>an ACH Debit is returned or dishonored for insufficient funds and, within five (5) Business Days after written notice from Purchaser, Merchant has neither paid the returned amount nor delivered a good-faith Reconciliation Request under Section 3; provided, that a return or dishonor resulting from a good-faith decline in Merchant’s Receipts, followed by a timely Reconciliation Request, shall not by itself constitute an Event of Default; or</w:t>
+      </w:r>
+    </w:p>
+    <w:p>
+      <w:pPr>
+        <w:pStyle w:val="ListParagraph"/>
+        <w:numPr>
+          <w:ilvl w:val="1"/>
+          <w:numId w:val="7"/>
+        </w:numPr>
+        <w:spacing w:line="247" w:lineRule="auto"/>
+        <w:ind w:right="117" w:left="360" w:hanging="360"/>
+        <w:tabs>
+          <w:tab w:val="left" w:pos="360"/>
+        </w:tabs>
+      </w:pPr>
+      <w:r>
+        <w:rPr>
+          <w:color w:val="010202"/>
+        </w:rPr>
+        <w:t>(j)</w:t>
+        <w:tab/>
+      </w:r>
+      <w:r>
+        <w:rPr>
+          <w:color w:val="010202"/>
+        </w:rPr>
+        <w:t>Merchant or any Owner/Guarantor breaches, or fails to perform or observe, any other representation, warranty, covenant, agreement, or provision of this Agreement or any Ancillary Document, and, if such breach is capable of cure, fails to cure it within five (5) Business Days after written notice from Purchaser.</w:t>
+      </w:r>
+    </w:p>
+    <w:p>
+      <w:pPr>
+        <w:pStyle w:val="ListParagraph"/>
+        <w:numPr>
+          <w:ilvl w:val="1"/>
+          <w:numId w:val="7"/>
+        </w:numPr>
+        <w:tabs>
+          <w:tab w:val="left" w:pos="874"/>
+        </w:tabs>
+        <w:spacing w:line="247" w:lineRule="auto"/>
+        <w:ind w:right="117"/>
+      </w:pPr>
+      <w:r>
+        <w:rPr>
+          <w:color w:val="010202"/>
+        </w:rPr>
+        <w:t>7.2</w:t>
+        <w:tab/>
+      </w:r>
+      <w:r>
+        <w:rPr>
+          <w:color w:val="010202"/>
+        </w:rPr>
+        <w:t>Remedies.  Upon the occurrence of any Event of Default, Purchaser may, without any demand, protest, notice of protest or other notice of any kind, all of which Merchant hereby waives, proceed to protect and enforce its rights or remedies set forth below in this Section 7.2 and such other rights and remedies available to it under applicable law, whether by suit for specific performance or other equitable relief or by action at law, or both, or otherwise, including an action for breach of this Agreement and monetary damages as a result thereof:</w:t>
       </w:r>
     </w:p>
     <w:p>
@@ -11757,235 +12052,7 @@
         <w:rPr>
           <w:color w:val="010202"/>
         </w:rPr>
-        <w:t>The Specified Percentage shall equal 100% and the then outstanding balance of the Purchased Amount plus all fees</w:t>
-      </w:r>
-      <w:r>
-        <w:rPr>
-          <w:color w:val="010202"/>
-        </w:rPr>
-        <w:t xml:space="preserve"> </w:t>
-      </w:r>
-      <w:r>
-        <w:rPr>
-          <w:color w:val="010202"/>
-        </w:rPr>
-        <w:t>and</w:t>
-      </w:r>
-      <w:r>
-        <w:rPr>
-          <w:color w:val="010202"/>
-        </w:rPr>
-        <w:t xml:space="preserve"> </w:t>
-      </w:r>
-      <w:r>
-        <w:rPr>
-          <w:color w:val="010202"/>
-        </w:rPr>
-        <w:t>charges</w:t>
-      </w:r>
-      <w:r>
-        <w:rPr>
-          <w:color w:val="010202"/>
-        </w:rPr>
-        <w:t xml:space="preserve"> </w:t>
-      </w:r>
-      <w:r>
-        <w:rPr>
-          <w:color w:val="010202"/>
-        </w:rPr>
-        <w:t>(including</w:t>
-      </w:r>
-      <w:r>
-        <w:rPr>
-          <w:color w:val="010202"/>
-        </w:rPr>
-        <w:t xml:space="preserve"> </w:t>
-      </w:r>
-      <w:r>
-        <w:rPr>
-          <w:color w:val="010202"/>
-        </w:rPr>
-        <w:t>legal</w:t>
-      </w:r>
-      <w:r>
-        <w:rPr>
-          <w:color w:val="010202"/>
-        </w:rPr>
-        <w:t xml:space="preserve"> </w:t>
-      </w:r>
-      <w:r>
-        <w:rPr>
-          <w:color w:val="010202"/>
-        </w:rPr>
-        <w:t>fees)</w:t>
-      </w:r>
-      <w:r>
-        <w:rPr>
-          <w:color w:val="010202"/>
-        </w:rPr>
-        <w:t xml:space="preserve"> </w:t>
-      </w:r>
-      <w:r>
-        <w:rPr>
-          <w:color w:val="010202"/>
-        </w:rPr>
-        <w:t>payable</w:t>
-      </w:r>
-      <w:r>
-        <w:rPr>
-          <w:color w:val="010202"/>
-        </w:rPr>
-        <w:t xml:space="preserve"> </w:t>
-      </w:r>
-      <w:r>
-        <w:rPr>
-          <w:color w:val="010202"/>
-        </w:rPr>
-        <w:t>by</w:t>
-      </w:r>
-      <w:r>
-        <w:rPr>
-          <w:color w:val="010202"/>
-        </w:rPr>
-        <w:t xml:space="preserve"> </w:t>
-      </w:r>
-      <w:r>
-        <w:rPr>
-          <w:color w:val="010202"/>
-        </w:rPr>
-        <w:t>Merchant</w:t>
-      </w:r>
-      <w:r>
-        <w:rPr>
-          <w:color w:val="010202"/>
-        </w:rPr>
-        <w:t xml:space="preserve"> </w:t>
-      </w:r>
-      <w:r>
-        <w:rPr>
-          <w:color w:val="010202"/>
-        </w:rPr>
-        <w:t>under</w:t>
-      </w:r>
-      <w:r>
-        <w:rPr>
-          <w:color w:val="010202"/>
-        </w:rPr>
-        <w:t xml:space="preserve"> </w:t>
-      </w:r>
-      <w:r>
-        <w:rPr>
-          <w:color w:val="010202"/>
-        </w:rPr>
-        <w:t>this</w:t>
-      </w:r>
-      <w:r>
-        <w:rPr>
-          <w:color w:val="010202"/>
-        </w:rPr>
-        <w:t xml:space="preserve"> </w:t>
-      </w:r>
-      <w:r>
-        <w:rPr>
-          <w:color w:val="010202"/>
-        </w:rPr>
-        <w:t>Agreement</w:t>
-      </w:r>
-      <w:r>
-        <w:rPr>
-          <w:color w:val="010202"/>
-        </w:rPr>
-        <w:t xml:space="preserve"> </w:t>
-      </w:r>
-      <w:r>
-        <w:rPr>
-          <w:color w:val="010202"/>
-        </w:rPr>
-        <w:t>shall</w:t>
-      </w:r>
-      <w:r>
-        <w:rPr>
-          <w:color w:val="010202"/>
-        </w:rPr>
-        <w:t xml:space="preserve"> </w:t>
-      </w:r>
-      <w:r>
-        <w:rPr>
-          <w:color w:val="010202"/>
-        </w:rPr>
-        <w:t>be</w:t>
-      </w:r>
-      <w:r>
-        <w:rPr>
-          <w:color w:val="010202"/>
-        </w:rPr>
-        <w:t xml:space="preserve"> </w:t>
-      </w:r>
-      <w:r>
-        <w:rPr>
-          <w:color w:val="010202"/>
-        </w:rPr>
-        <w:t>due</w:t>
-      </w:r>
-      <w:r>
-        <w:rPr>
-          <w:color w:val="010202"/>
-        </w:rPr>
-        <w:t xml:space="preserve"> </w:t>
-      </w:r>
-      <w:r>
-        <w:rPr>
-          <w:color w:val="010202"/>
-        </w:rPr>
-        <w:t>and</w:t>
-      </w:r>
-      <w:r>
-        <w:rPr>
-          <w:color w:val="010202"/>
-        </w:rPr>
-        <w:t xml:space="preserve"> </w:t>
-      </w:r>
-      <w:r>
-        <w:rPr>
-          <w:color w:val="010202"/>
-        </w:rPr>
-        <w:t>payable</w:t>
-      </w:r>
-      <w:r>
-        <w:rPr>
-          <w:color w:val="010202"/>
-        </w:rPr>
-        <w:t xml:space="preserve"> </w:t>
-      </w:r>
-      <w:r>
-        <w:rPr>
-          <w:color w:val="010202"/>
-        </w:rPr>
-        <w:t>in</w:t>
-      </w:r>
-      <w:r>
-        <w:rPr>
-          <w:color w:val="010202"/>
-        </w:rPr>
-        <w:t xml:space="preserve"> </w:t>
-      </w:r>
-      <w:r>
-        <w:rPr>
-          <w:color w:val="010202"/>
-        </w:rPr>
-        <w:t>full</w:t>
-      </w:r>
-      <w:r>
-        <w:rPr>
-          <w:color w:val="010202"/>
-        </w:rPr>
-        <w:t xml:space="preserve"> </w:t>
-      </w:r>
-      <w:r>
-        <w:rPr>
-          <w:color w:val="010202"/>
-        </w:rPr>
-        <w:t>immediately.</w:t>
+        <w:t>Purchaser may recover the then-unpaid portion of the Purchased Amount, together with any periodic payments that have accrued and remain unpaid and all fees and charges (including reasonable legal fees) payable by Merchant under this Agreement, and may pursue all other rights and remedies available to it under this Agreement and applicable law.</w:t>
       </w:r>
     </w:p>
     <w:p>
@@ -12403,7 +12470,7 @@
         <w:rPr>
           <w:color w:val="010202"/>
         </w:rPr>
-        <w:t>7.2</w:t>
+        <w:t>7.3</w:t>
       </w:r>
       <w:r>
         <w:rPr>
@@ -12444,6 +12511,7 @@
         <w:spacing w:line="247" w:lineRule="auto"/>
         <w:jc w:val="left"/>
         <w:sectPr>
+          <w:type w:val="continuous"/>
           <w:pgSz w:w="12240" w:h="15840"/>
           <w:pgMar w:top="580" w:right="360" w:bottom="500" w:left="360" w:header="0" w:footer="311" w:gutter="0"/>
           <w:cols w:space="720"/>
@@ -13004,7 +13072,7 @@
         <w:rPr>
           <w:color w:val="010202"/>
         </w:rPr>
-        <w:t xml:space="preserve"> Purchaser under this Agreement. For the avoidance of doubt, no assignment, transfer or sale of this Agreement or Purchaser's rights hereunder by Purchaser or any such Affiliate as collateral security shall constitute, or be deemed or construed to constitute, an assignment, transfer or sale for purposes of this Section 11.2. This Agreement and each Ancillary Document shall be binding upon and inure to the benefit of the Parties and their respective successors, permitted assigns, executors, personal representatives and heirs. No Person, other than the Parties and their respective successors, permitted assigns, executors, personal representatives and heirs, is entitled to the benefit of this Agreement or any Ancillary Document, or any provision hereof or thereof, provided that Purchaser, both as a principal and as Agent, each Syndicate</w:t>
+        <w:t xml:space="preserve"> Purchaser under this Agreement. For the avoidance of doubt, no assignment, transfer or sale of this Agreement or Purchaser's rights hereunder by Purchaser or any such Affiliate as collateral security shall constitute, or be deemed or construed to constitute, an assignment, transfer or sale for purposes of this Section 9.2. This Agreement and each Ancillary Document shall be binding upon and inure to the benefit of the Parties and their respective successors, permitted assigns, executors, personal representatives and heirs. No Person, other than the Parties and their respective successors, permitted assigns, executors, personal representatives and heirs, is entitled to the benefit of this Agreement or any Ancillary Document, or any provision hereof or thereof, provided that Purchaser, both as a principal and as Agent, each Syndicate</w:t>
       </w:r>
       <w:r>
         <w:rPr>
@@ -13028,7 +13096,7 @@
         <w:rPr>
           <w:color w:val="010202"/>
         </w:rPr>
-        <w:t>of Purchaser and each Syndicate Partner, and the Financial Institution, and the successors, permitted assigns, executors,personal representatives and heirs of each of the foregoing, shall be third party beneficiaries of this Agreement and theAncillary Documents and may rely upon the terms of this Agreement and the Ancillary Documents and raise them as a defense in any Proceeding. The provisions of Sections 6.14, 7, 8 and 9 and this Section 11 shall survive the satisfaction in full of the Merchant Obligations, and the provisions of Sections 2, 6.14, 7, 8, 9, 10 and this Section 11, and any other provision of this Agreement that by its terms or intention should survive, shall survive any other termination or expiration of this Agreement.</w:t>
+        <w:t>of Purchaser and each Syndicate Partner, and the Financial Institution, and the successors, permitted assigns, executors,personal representatives and heirs of each of the foregoing, shall be third party beneficiaries of this Agreement and theAncillary Documents and may rely upon the terms of this Agreement and the Ancillary Documents and raise them as a defense in any Proceeding. The provisions of Sections 6.14, 7, 8 and 9 and this Section 9 shall survive the satisfaction in full of the Merchant Obligations, and the provisions of Sections 2, 6.14, 7, 8, 9 and this Section 9, and any other provision of this Agreement that by its terms or intention should survive, shall survive any other termination or expiration of this Agreement.</w:t>
       </w:r>
     </w:p>
     <w:p>
@@ -13036,6 +13104,7 @@
         <w:pStyle w:val="ListParagraph"/>
         <w:spacing w:line="247" w:lineRule="auto"/>
         <w:sectPr>
+          <w:type w:val="continuous"/>
           <w:pgSz w:w="12240" w:h="15840"/>
           <w:pgMar w:top="580" w:right="360" w:bottom="500" w:left="360" w:header="0" w:footer="311" w:gutter="0"/>
           <w:cols w:space="720"/>
@@ -13369,7 +13438,7 @@
         <w:rPr>
           <w:color w:val="010202"/>
         </w:rPr>
-        <w:t>any such controversy or claim may be made in accordance with the provisions of Section 11.12 for the giving of notices under this Agreement. For the avoidance of doubt, Purchaser or its assigns or agents may serve any summons, complaint or other process to commence or prosecute any Proceeding against Merchant and/or Owner/Guarantor by mailing the same by registered or certified mail, return receipt requested, to the respective mailing addresses set forth in Section 11.12 and any such mailing shall constitute proper service thereof for all purposes.</w:t>
+        <w:t>any such controversy or claim may be made in accordance with the provisions of Section 9.13 for the giving of notices under this Agreement. For the avoidance of doubt, Purchaser or its assigns or agents may serve any summons, complaint or other process to commence or prosecute any Proceeding against Merchant and/or Owner/Guarantor by mailing the same by registered or certified mail, return receipt requested, to the respective mailing addresses set forth in Section 9.13 and any such mailing shall constitute proper service thereof for all purposes.</w:t>
       </w:r>
     </w:p>
     <w:p>
@@ -13515,6 +13584,7 @@
         <w:pStyle w:val="ListParagraph"/>
         <w:spacing w:line="247" w:lineRule="auto"/>
         <w:sectPr>
+          <w:type w:val="continuous"/>
           <w:pgSz w:w="12240" w:h="15840"/>
           <w:pgMar w:top="580" w:right="360" w:bottom="500" w:left="360" w:header="0" w:footer="311" w:gutter="0"/>
           <w:cols w:space="720"/>
@@ -13744,7 +13814,7 @@
         <w:rPr>
           <w:color w:val="010202"/>
         </w:rPr>
-        <w:t>threatens to breach any provision of Section 9, Purchaser may suffer irreparable damage for which monetary relief will not be an</w:t>
+        <w:t>threatens to breach the confidentiality obligations set forth in Section 9.15, Purchaser may suffer irreparable damage for which monetary relief will not be an</w:t>
       </w:r>
       <w:r>
         <w:rPr>
@@ -14597,6 +14667,7 @@
         <w:pStyle w:val="ListParagraph"/>
         <w:spacing w:line="247" w:lineRule="auto"/>
         <w:sectPr>
+          <w:type w:val="continuous"/>
           <w:pgSz w:w="12240" w:h="15840"/>
           <w:pgMar w:top="580" w:right="360" w:bottom="500" w:left="360" w:header="0" w:footer="311" w:gutter="0"/>
           <w:cols w:space="720"/>
@@ -15177,7 +15248,7 @@
         <w:rPr>
           <w:color w:val="010202"/>
         </w:rPr>
-        <w:t>other person's attention) as may be specified by a written notice given in accordance with this Section 11.12. Notices given by registered mail shall be effective five (5) Business Days after mailing, notices given by overnight courier service shall be effective on the next Business Day and notices given by email or facsimile shall be given when received. Unless otherwise expressly provided for in this Agreement, notwithstanding the foregoing, Merchant may not give any notice to Purchaser via email or facsimile unless Purchaser expressly consents thereto in its sole discretion.</w:t>
+        <w:t>other person's attention) as may be specified by a written notice given in accordance with this Section 9.13. Notices given by registered mail shall be effective five (5) Business Days after mailing, notices given by overnight courier service shall be effective on the next Business Day and notices given by email or facsimile shall be given when received. Unless otherwise expressly provided for in this Agreement, notwithstanding the foregoing, Merchant may not give any notice to Purchaser via email or facsimile unless Purchaser expressly consents thereto in its sole discretion.</w:t>
       </w:r>
     </w:p>
     <w:p>
@@ -15513,6 +15584,34 @@
     </w:p>
     <w:p>
       <w:pPr>
+        <w:pStyle w:val="ListParagraph"/>
+        <w:numPr>
+          <w:ilvl w:val="1"/>
+          <w:numId w:val="4"/>
+        </w:numPr>
+        <w:tabs>
+          <w:tab w:val="left" w:pos="874"/>
+        </w:tabs>
+        <w:spacing w:before="63" w:line="247" w:lineRule="auto"/>
+        <w:ind w:right="115"/>
+        <w:jc w:val="left"/>
+      </w:pPr>
+      <w:r>
+        <w:rPr>
+          <w:color w:val="010202"/>
+        </w:rPr>
+        <w:t>9.15</w:t>
+        <w:tab/>
+      </w:r>
+      <w:r>
+        <w:rPr>
+          <w:color w:val="010202"/>
+        </w:rPr>
+        <w:t>Confidentiality.  Merchant and each Owner/Guarantor shall keep confidential, and shall not disclose to any Person (other than to their respective attorneys, accountants and other professional advisors who have a need to know and who are bound to keep such information confidential, or as required by applicable law or valid legal process), the terms of this Agreement, including the Purchase Price, the Purchased Amount, the Specified Percentage, the periodic payment amounts, the fees and any other pricing or economic terms, and the existence and substance of the negotiations relating hereto.  The obligations set forth in this Section 9.15 shall survive the satisfaction, termination or expiration of this Agreement.</w:t>
+      </w:r>
+    </w:p>
+    <w:p>
+      <w:pPr>
         <w:pStyle w:val="Heading2"/>
         <w:spacing w:before="224"/>
         <w:ind w:left="120"/>
@@ -15718,6 +15817,7 @@
         <w:pStyle w:val="ListParagraph"/>
         <w:spacing w:line="247" w:lineRule="auto"/>
         <w:sectPr>
+          <w:type w:val="continuous"/>
           <w:pgSz w:w="12240" w:h="15840"/>
           <w:pgMar w:top="580" w:right="360" w:bottom="500" w:left="360" w:header="0" w:footer="311" w:gutter="0"/>
           <w:cols w:space="720"/>
@@ -16331,6 +16431,7 @@
         <w:pStyle w:val="Heading1"/>
         <w:jc w:val="both"/>
         <w:sectPr>
+          <w:type w:val="continuous"/>
           <w:pgSz w:w="12240" w:h="15840"/>
           <w:pgMar w:top="580" w:right="360" w:bottom="500" w:left="360" w:header="0" w:footer="311" w:gutter="0"/>
           <w:cols w:space="720"/>
@@ -16441,7 +16542,7 @@
                 <w:noProof/>
                 <w:u w:val="none"/>
               </w:rPr>
-              <w:t>«Merchant_Legal_Name»</w:t>
+              <w:t>«Merchant_Display_Name»</w:t>
             </w:r>
             <w:r>
               <w:rPr>
@@ -18427,7 +18528,7 @@
         <w:rPr>
           <w:color w:val="010202"/>
         </w:rPr>
-        <w:t>D</w:t>
+        <w:t>A</w:t>
       </w:r>
       <w:r>
         <w:rPr>
@@ -19209,7 +19310,7 @@
           <w:noProof/>
           <w:color w:val="010202"/>
         </w:rPr>
-        <w:t>«Merchant_Legal_Name»</w:t>
+        <w:t>«Merchant_Display_Name»</w:t>
       </w:r>
       <w:r>
         <w:rPr>
@@ -22907,7 +23008,7 @@
           <w:noProof/>
           <w:color w:val="010202"/>
         </w:rPr>
-        <w:t>«Merchant_Legal_Name»</w:t>
+        <w:t>«Merchant_Display_Name»</w:t>
       </w:r>
       <w:r>
         <w:rPr>
@@ -24656,7 +24757,7 @@
           <w:color w:val="010202"/>
           <w:u w:val="none"/>
         </w:rPr>
-        <w:t>«Merchant_Legal_Name»</w:t>
+        <w:t>«Merchant_Display_Name»</w:t>
       </w:r>
       <w:r>
         <w:rPr>

</xml_diff>